<commit_message>
Word: build the Tanzania comparison into results.docx as Section 9
comparison.md stays a separate Markdown source; build_word.py appends it to the
results chapter with headings demoted (9.1-9.5) and drops comparison.docx.
</commit_message>
<xml_diff>
--- a/docs/thesis/results.docx
+++ b/docs/thesis/results.docx
@@ -2,7 +2,7 @@
 <file path=word/document.xml><?xml version="1.0" encoding="utf-8"?>
 <w:document xmlns:w="http://schemas.openxmlformats.org/wordprocessingml/2006/main" xmlns:m="http://schemas.openxmlformats.org/officeDocument/2006/math" xmlns:r="http://schemas.openxmlformats.org/officeDocument/2006/relationships" xmlns:o="urn:schemas-microsoft-com:office:office" xmlns:v="urn:schemas-microsoft-com:vml" xmlns:w10="urn:schemas-microsoft-com:office:word" xmlns:a="http://schemas.openxmlformats.org/drawingml/2006/main" xmlns:pic="http://schemas.openxmlformats.org/drawingml/2006/picture" xmlns:wp="http://schemas.openxmlformats.org/drawingml/2006/wordprocessingDrawing">
   <w:body>
-    <w:bookmarkStart w:id="58" w:name="results"/>
+    <w:bookmarkStart w:id="73" w:name="results"/>
     <w:p>
       <w:pPr>
         <w:pStyle w:val="Heading1"/>
@@ -3829,7 +3829,2040 @@
       </w:r>
     </w:p>
     <w:bookmarkEnd w:id="57"/>
+    <w:bookmarkStart w:id="72" w:name="X6aba5e7a7691003d220c9ab0bb8435aefed464f"/>
+    <w:p>
+      <w:pPr>
+        <w:pStyle w:val="Heading2"/>
+      </w:pPr>
+      <w:r>
+        <w:t xml:space="preserve">9 Comparison with a tropical gas platform (Tanzania)</w:t>
+      </w:r>
+    </w:p>
+    <w:bookmarkStart w:id="58" w:name="the-two-settings"/>
+    <w:p>
+      <w:pPr>
+        <w:pStyle w:val="Heading3"/>
+      </w:pPr>
+      <w:r>
+        <w:t xml:space="preserve">9.1 The two settings</w:t>
+      </w:r>
+    </w:p>
+    <w:p>
+      <w:pPr>
+        <w:pStyle w:val="FirstParagraph"/>
+      </w:pPr>
+      <w:r>
+        <w:t xml:space="preserve">The two sites differ in almost every input that matters for the result</w:t>
+      </w:r>
+      <w:r>
+        <w:t xml:space="preserve"> </w:t>
+      </w:r>
+      <w:r>
+        <w:t xml:space="preserve">(Table C1). The Tanzanian platform is smaller and dominated by one large</w:t>
+      </w:r>
+      <w:r>
+        <w:t xml:space="preserve"> </w:t>
+      </w:r>
+      <w:r>
+        <w:t xml:space="preserve">consumer, the export compressor. Its wind resource is much weaker: the mean</w:t>
+      </w:r>
+      <w:r>
+        <w:t xml:space="preserve"> </w:t>
+      </w:r>
+      <w:r>
+        <w:t xml:space="preserve">hub-height wind speed is 6.7 m/s against 9.8 m/s, and the capacity factor of</w:t>
+      </w:r>
+      <w:r>
+        <w:t xml:space="preserve"> </w:t>
+      </w:r>
+      <w:r>
+        <w:t xml:space="preserve">the same 30 MW wind farm is 29.6 % against 50.9 %. The seasons are opposite</w:t>
+      </w:r>
+      <w:r>
+        <w:t xml:space="preserve"> </w:t>
+      </w:r>
+      <w:r>
+        <w:t xml:space="preserve">(Figure 11, middle). Tanzanian wind peaks in the south-east monsoon (July</w:t>
+      </w:r>
+      <w:r>
+        <w:t xml:space="preserve"> </w:t>
+      </w:r>
+      <w:r>
+        <w:t xml:space="preserve">63 %) and almost disappears in December (10 %), the pattern reported from</w:t>
+      </w:r>
+      <w:r>
+        <w:t xml:space="preserve"> </w:t>
+      </w:r>
+      <w:r>
+        <w:t xml:space="preserve">measurements at coastal Tanzanian stations. The North Sea is windiest in winter.</w:t>
+      </w:r>
+      <w:r>
+        <w:t xml:space="preserve"> </w:t>
+      </w:r>
+      <w:r>
+        <w:t xml:space="preserve">The hot climate costs the gas turbines 8 % of their power, and the lean</w:t>
+      </w:r>
+      <w:r>
+        <w:t xml:space="preserve"> </w:t>
+      </w:r>
+      <w:r>
+        <w:t xml:space="preserve">fuel gas emits 17 % less CO2 per Sm³ than Norwegian fuel gas.</w:t>
+      </w:r>
+    </w:p>
+    <w:p>
+      <w:pPr>
+        <w:pStyle w:val="BodyText"/>
+      </w:pPr>
+      <w:r>
+        <w:rPr>
+          <w:bCs/>
+          <w:b/>
+        </w:rPr>
+        <w:t xml:space="preserve">Table C1.</w:t>
+      </w:r>
+      <w:r>
+        <w:t xml:space="preserve"> </w:t>
+      </w:r>
+      <w:r>
+        <w:t xml:space="preserve">Main inputs and results for the two sites (case numbers as in</w:t>
+      </w:r>
+      <w:r>
+        <w:t xml:space="preserve"> </w:t>
+      </w:r>
+      <w:r>
+        <w:t xml:space="preserve">Section 3; CO2 in kt per year).</w:t>
+      </w:r>
+    </w:p>
+    <w:tbl>
+      <w:tblPr>
+        <w:tblStyle w:val="Table"/>
+        <w:tblW w:type="pct" w:w="5000"/>
+        <w:tblLook w:firstRow="1" w:lastRow="0" w:firstColumn="0" w:lastColumn="0" w:noHBand="0" w:noVBand="0" w:val="0020"/>
+        <w:jc w:val="start"/>
+        <w:tblBorders>
+          <w:top w:val="single" w:sz="4" w:space="0" w:color="808080"/>
+          <w:left w:val="single" w:sz="4" w:space="0" w:color="808080"/>
+          <w:bottom w:val="single" w:sz="4" w:space="0" w:color="808080"/>
+          <w:right w:val="single" w:sz="4" w:space="0" w:color="808080"/>
+          <w:insideH w:val="single" w:sz="4" w:space="0" w:color="808080"/>
+          <w:insideV w:val="single" w:sz="4" w:space="0" w:color="808080"/>
+        </w:tblBorders>
+      </w:tblPr>
+      <w:tblGrid>
+        <w:gridCol w:w="2640"/>
+        <w:gridCol w:w="2640"/>
+        <w:gridCol w:w="2640"/>
+      </w:tblGrid>
+      <w:tr>
+        <w:trPr>
+          <w:tblHeader w:val="true"/>
+        </w:trPr>
+        <w:tc>
+          <w:tcPr/>
+          <w:p>
+            <w:pPr>
+              <w:pStyle w:val="Compact"/>
+            </w:pPr>
+          </w:p>
+        </w:tc>
+        <w:tc>
+          <w:tcPr/>
+          <w:p>
+            <w:pPr>
+              <w:pStyle w:val="Compact"/>
+              <w:jc w:val="left"/>
+            </w:pPr>
+            <w:r>
+              <w:t xml:space="preserve">North Sea (Tampen)</w:t>
+            </w:r>
+          </w:p>
+        </w:tc>
+        <w:tc>
+          <w:tcPr/>
+          <w:p>
+            <w:pPr>
+              <w:pStyle w:val="Compact"/>
+              <w:jc w:val="left"/>
+            </w:pPr>
+            <w:r>
+              <w:t xml:space="preserve">Tanzania (Blocks 1, 2, 4)</w:t>
+            </w:r>
+          </w:p>
+        </w:tc>
+      </w:tr>
+      <w:tr>
+        <w:tc>
+          <w:tcPr/>
+          <w:p>
+            <w:pPr>
+              <w:pStyle w:val="Compact"/>
+              <w:jc w:val="left"/>
+            </w:pPr>
+            <w:r>
+              <w:t xml:space="preserve">Platform</w:t>
+            </w:r>
+          </w:p>
+        </w:tc>
+        <w:tc>
+          <w:tcPr/>
+          <w:p>
+            <w:pPr>
+              <w:pStyle w:val="Compact"/>
+              <w:jc w:val="left"/>
+            </w:pPr>
+            <w:r>
+              <w:t xml:space="preserve">oil, water injection</w:t>
+            </w:r>
+          </w:p>
+        </w:tc>
+        <w:tc>
+          <w:tcPr/>
+          <w:p>
+            <w:pPr>
+              <w:pStyle w:val="Compact"/>
+              <w:jc w:val="left"/>
+            </w:pPr>
+            <w:r>
+              <w:t xml:space="preserve">gas, export compression</w:t>
+            </w:r>
+          </w:p>
+        </w:tc>
+      </w:tr>
+      <w:tr>
+        <w:tc>
+          <w:tcPr/>
+          <w:p>
+            <w:pPr>
+              <w:pStyle w:val="Compact"/>
+              <w:jc w:val="left"/>
+            </w:pPr>
+            <w:r>
+              <w:t xml:space="preserve">Design electric demand</w:t>
+            </w:r>
+          </w:p>
+        </w:tc>
+        <w:tc>
+          <w:tcPr/>
+          <w:p>
+            <w:pPr>
+              <w:pStyle w:val="Compact"/>
+              <w:jc w:val="left"/>
+            </w:pPr>
+            <w:r>
+              <w:t xml:space="preserve">20.3 MW</w:t>
+            </w:r>
+          </w:p>
+        </w:tc>
+        <w:tc>
+          <w:tcPr/>
+          <w:p>
+            <w:pPr>
+              <w:pStyle w:val="Compact"/>
+              <w:jc w:val="left"/>
+            </w:pPr>
+            <w:r>
+              <w:t xml:space="preserve">15.4 MW</w:t>
+            </w:r>
+          </w:p>
+        </w:tc>
+      </w:tr>
+      <w:tr>
+        <w:tc>
+          <w:tcPr/>
+          <w:p>
+            <w:pPr>
+              <w:pStyle w:val="Compact"/>
+              <w:jc w:val="left"/>
+            </w:pPr>
+            <w:r>
+              <w:t xml:space="preserve">Largest consumer</w:t>
+            </w:r>
+          </w:p>
+        </w:tc>
+        <w:tc>
+          <w:tcPr/>
+          <w:p>
+            <w:pPr>
+              <w:pStyle w:val="Compact"/>
+              <w:jc w:val="left"/>
+            </w:pPr>
+            <w:r>
+              <w:t xml:space="preserve">water injection, 9.2 MW (45 %)</w:t>
+            </w:r>
+          </w:p>
+        </w:tc>
+        <w:tc>
+          <w:tcPr/>
+          <w:p>
+            <w:pPr>
+              <w:pStyle w:val="Compact"/>
+              <w:jc w:val="left"/>
+            </w:pPr>
+            <w:r>
+              <w:t xml:space="preserve">export compressor, 11.2 MW (73 %)</w:t>
+            </w:r>
+          </w:p>
+        </w:tc>
+      </w:tr>
+      <w:tr>
+        <w:tc>
+          <w:tcPr/>
+          <w:p>
+            <w:pPr>
+              <w:pStyle w:val="Compact"/>
+              <w:jc w:val="left"/>
+            </w:pPr>
+            <w:r>
+              <w:t xml:space="preserve">Mean hub wind speed</w:t>
+            </w:r>
+          </w:p>
+        </w:tc>
+        <w:tc>
+          <w:tcPr/>
+          <w:p>
+            <w:pPr>
+              <w:pStyle w:val="Compact"/>
+              <w:jc w:val="left"/>
+            </w:pPr>
+            <w:r>
+              <w:t xml:space="preserve">9.8 m/s</w:t>
+            </w:r>
+          </w:p>
+        </w:tc>
+        <w:tc>
+          <w:tcPr/>
+          <w:p>
+            <w:pPr>
+              <w:pStyle w:val="Compact"/>
+              <w:jc w:val="left"/>
+            </w:pPr>
+            <w:r>
+              <w:t xml:space="preserve">6.7 m/s</w:t>
+            </w:r>
+          </w:p>
+        </w:tc>
+      </w:tr>
+      <w:tr>
+        <w:tc>
+          <w:tcPr/>
+          <w:p>
+            <w:pPr>
+              <w:pStyle w:val="Compact"/>
+              <w:jc w:val="left"/>
+            </w:pPr>
+            <w:r>
+              <w:t xml:space="preserve">Wind capacity factor (2 × 15 MW)</w:t>
+            </w:r>
+          </w:p>
+        </w:tc>
+        <w:tc>
+          <w:tcPr/>
+          <w:p>
+            <w:pPr>
+              <w:pStyle w:val="Compact"/>
+              <w:jc w:val="left"/>
+            </w:pPr>
+            <w:r>
+              <w:t xml:space="preserve">50.9 %</w:t>
+            </w:r>
+          </w:p>
+        </w:tc>
+        <w:tc>
+          <w:tcPr/>
+          <w:p>
+            <w:pPr>
+              <w:pStyle w:val="Compact"/>
+              <w:jc w:val="left"/>
+            </w:pPr>
+            <w:r>
+              <w:t xml:space="preserve">29.6 %</w:t>
+            </w:r>
+          </w:p>
+        </w:tc>
+      </w:tr>
+      <w:tr>
+        <w:tc>
+          <w:tcPr/>
+          <w:p>
+            <w:pPr>
+              <w:pStyle w:val="Compact"/>
+              <w:jc w:val="left"/>
+            </w:pPr>
+            <w:r>
+              <w:t xml:space="preserve">GT rating at site (LEOGO)</w:t>
+            </w:r>
+          </w:p>
+        </w:tc>
+        <w:tc>
+          <w:tcPr/>
+          <w:p>
+            <w:pPr>
+              <w:pStyle w:val="Compact"/>
+              <w:jc w:val="left"/>
+            </w:pPr>
+            <w:r>
+              <w:t xml:space="preserve">21.8 MW, 34.7 %</w:t>
+            </w:r>
+          </w:p>
+        </w:tc>
+        <w:tc>
+          <w:tcPr/>
+          <w:p>
+            <w:pPr>
+              <w:pStyle w:val="Compact"/>
+              <w:jc w:val="left"/>
+            </w:pPr>
+            <w:r>
+              <w:t xml:space="preserve">20.0 MW, 34.3 % (26.8 °C)</w:t>
+            </w:r>
+          </w:p>
+        </w:tc>
+      </w:tr>
+      <w:tr>
+        <w:tc>
+          <w:tcPr/>
+          <w:p>
+            <w:pPr>
+              <w:pStyle w:val="Compact"/>
+              <w:jc w:val="left"/>
+            </w:pPr>
+            <w:r>
+              <w:t xml:space="preserve">Fuel CO2 factor</w:t>
+            </w:r>
+          </w:p>
+        </w:tc>
+        <w:tc>
+          <w:tcPr/>
+          <w:p>
+            <w:pPr>
+              <w:pStyle w:val="Compact"/>
+              <w:jc w:val="left"/>
+            </w:pPr>
+            <w:r>
+              <w:t xml:space="preserve">2.34 kg/Sm³</w:t>
+            </w:r>
+          </w:p>
+        </w:tc>
+        <w:tc>
+          <w:tcPr/>
+          <w:p>
+            <w:pPr>
+              <w:pStyle w:val="Compact"/>
+              <w:jc w:val="left"/>
+            </w:pPr>
+            <w:r>
+              <w:t xml:space="preserve">1.95 kg/Sm³</w:t>
+            </w:r>
+          </w:p>
+        </w:tc>
+      </w:tr>
+      <w:tr>
+        <w:tc>
+          <w:tcPr/>
+          <w:p>
+            <w:pPr>
+              <w:pStyle w:val="Compact"/>
+              <w:jc w:val="left"/>
+            </w:pPr>
+            <w:r>
+              <w:t xml:space="preserve">CO2 price</w:t>
+            </w:r>
+          </w:p>
+        </w:tc>
+        <w:tc>
+          <w:tcPr/>
+          <w:p>
+            <w:pPr>
+              <w:pStyle w:val="Compact"/>
+              <w:jc w:val="left"/>
+            </w:pPr>
+            <w:r>
+              <w:t xml:space="preserve">NOK 2.0/kg</w:t>
+            </w:r>
+          </w:p>
+        </w:tc>
+        <w:tc>
+          <w:tcPr/>
+          <w:p>
+            <w:pPr>
+              <w:pStyle w:val="Compact"/>
+              <w:jc w:val="left"/>
+            </w:pPr>
+            <w:r>
+              <w:t xml:space="preserve">NOK 0.09/kg (2025 excise duty)</w:t>
+            </w:r>
+          </w:p>
+        </w:tc>
+      </w:tr>
+      <w:tr>
+        <w:tc>
+          <w:tcPr/>
+          <w:p>
+            <w:pPr>
+              <w:pStyle w:val="Compact"/>
+              <w:jc w:val="left"/>
+            </w:pPr>
+            <w:r>
+              <w:t xml:space="preserve">Flexibility buffer</w:t>
+            </w:r>
+          </w:p>
+        </w:tc>
+        <w:tc>
+          <w:tcPr/>
+          <w:p>
+            <w:pPr>
+              <w:pStyle w:val="Compact"/>
+              <w:jc w:val="left"/>
+            </w:pPr>
+            <w:r>
+              <w:t xml:space="preserve">72 h of water injection</w:t>
+            </w:r>
+          </w:p>
+        </w:tc>
+        <w:tc>
+          <w:tcPr/>
+          <w:p>
+            <w:pPr>
+              <w:pStyle w:val="Compact"/>
+              <w:jc w:val="left"/>
+            </w:pPr>
+            <w:r>
+              <w:t xml:space="preserve">3.6 h line pack + 48 h MEG tank</w:t>
+            </w:r>
+          </w:p>
+        </w:tc>
+      </w:tr>
+      <w:tr>
+        <w:tc>
+          <w:tcPr/>
+          <w:p>
+            <w:pPr>
+              <w:pStyle w:val="Compact"/>
+              <w:jc w:val="left"/>
+            </w:pPr>
+            <w:r>
+              <w:t xml:space="preserve">Case 1 – GTs only</w:t>
+            </w:r>
+          </w:p>
+        </w:tc>
+        <w:tc>
+          <w:tcPr/>
+          <w:p>
+            <w:pPr>
+              <w:pStyle w:val="Compact"/>
+              <w:jc w:val="left"/>
+            </w:pPr>
+            <w:r>
+              <w:t xml:space="preserve">127.7</w:t>
+            </w:r>
+          </w:p>
+        </w:tc>
+        <w:tc>
+          <w:tcPr/>
+          <w:p>
+            <w:pPr>
+              <w:pStyle w:val="Compact"/>
+              <w:jc w:val="left"/>
+            </w:pPr>
+            <w:r>
+              <w:t xml:space="preserve">101.7</w:t>
+            </w:r>
+          </w:p>
+        </w:tc>
+      </w:tr>
+      <w:tr>
+        <w:tc>
+          <w:tcPr/>
+          <w:p>
+            <w:pPr>
+              <w:pStyle w:val="Compact"/>
+              <w:jc w:val="left"/>
+            </w:pPr>
+            <w:r>
+              <w:t xml:space="preserve">Case 2 – wind, fixed demand</w:t>
+            </w:r>
+          </w:p>
+        </w:tc>
+        <w:tc>
+          <w:tcPr/>
+          <w:p>
+            <w:pPr>
+              <w:pStyle w:val="Compact"/>
+              <w:jc w:val="left"/>
+            </w:pPr>
+            <w:r>
+              <w:t xml:space="preserve">64.7 (−49.4 %)</w:t>
+            </w:r>
+          </w:p>
+        </w:tc>
+        <w:tc>
+          <w:tcPr/>
+          <w:p>
+            <w:pPr>
+              <w:pStyle w:val="Compact"/>
+              <w:jc w:val="left"/>
+            </w:pPr>
+            <w:r>
+              <w:t xml:space="preserve">57.8 (−43.2 %)</w:t>
+            </w:r>
+          </w:p>
+        </w:tc>
+      </w:tr>
+      <w:tr>
+        <w:tc>
+          <w:tcPr/>
+          <w:p>
+            <w:pPr>
+              <w:pStyle w:val="Compact"/>
+              <w:jc w:val="left"/>
+            </w:pPr>
+            <w:r>
+              <w:t xml:space="preserve">Case 3 – wind, flexible</w:t>
+            </w:r>
+          </w:p>
+        </w:tc>
+        <w:tc>
+          <w:tcPr/>
+          <w:p>
+            <w:pPr>
+              <w:pStyle w:val="Compact"/>
+              <w:jc w:val="left"/>
+            </w:pPr>
+            <w:r>
+              <w:t xml:space="preserve">57.5 (−54.9 %)</w:t>
+            </w:r>
+          </w:p>
+        </w:tc>
+        <w:tc>
+          <w:tcPr/>
+          <w:p>
+            <w:pPr>
+              <w:pStyle w:val="Compact"/>
+              <w:jc w:val="left"/>
+            </w:pPr>
+            <w:r>
+              <w:t xml:space="preserve">55.2 (−45.7 %)</w:t>
+            </w:r>
+          </w:p>
+        </w:tc>
+      </w:tr>
+      <w:tr>
+        <w:tc>
+          <w:tcPr/>
+          <w:p>
+            <w:pPr>
+              <w:pStyle w:val="Compact"/>
+              <w:jc w:val="left"/>
+            </w:pPr>
+            <w:r>
+              <w:t xml:space="preserve">Case 4 – case 3 + battery</w:t>
+            </w:r>
+          </w:p>
+        </w:tc>
+        <w:tc>
+          <w:tcPr/>
+          <w:p>
+            <w:pPr>
+              <w:pStyle w:val="Compact"/>
+              <w:jc w:val="left"/>
+            </w:pPr>
+            <w:r>
+              <w:t xml:space="preserve">57.1 (−55.2 %)</w:t>
+            </w:r>
+          </w:p>
+        </w:tc>
+        <w:tc>
+          <w:tcPr/>
+          <w:p>
+            <w:pPr>
+              <w:pStyle w:val="Compact"/>
+              <w:jc w:val="left"/>
+            </w:pPr>
+            <w:r>
+              <w:t xml:space="preserve">55.0 (−45.9 %)</w:t>
+            </w:r>
+          </w:p>
+        </w:tc>
+      </w:tr>
+      <w:tr>
+        <w:tc>
+          <w:tcPr/>
+          <w:p>
+            <w:pPr>
+              <w:pStyle w:val="Compact"/>
+              <w:jc w:val="left"/>
+            </w:pPr>
+            <w:r>
+              <w:t xml:space="preserve">Flexibility benefit (case 2 − 3)</w:t>
+            </w:r>
+          </w:p>
+        </w:tc>
+        <w:tc>
+          <w:tcPr/>
+          <w:p>
+            <w:pPr>
+              <w:pStyle w:val="Compact"/>
+              <w:jc w:val="left"/>
+            </w:pPr>
+            <w:r>
+              <w:t xml:space="preserve">7.1 kt (11.0 %)</w:t>
+            </w:r>
+          </w:p>
+        </w:tc>
+        <w:tc>
+          <w:tcPr/>
+          <w:p>
+            <w:pPr>
+              <w:pStyle w:val="Compact"/>
+              <w:jc w:val="left"/>
+            </w:pPr>
+            <w:r>
+              <w:t xml:space="preserve">2.6 kt (4.5 %)</w:t>
+            </w:r>
+          </w:p>
+        </w:tc>
+      </w:tr>
+      <w:tr>
+        <w:tc>
+          <w:tcPr/>
+          <w:p>
+            <w:pPr>
+              <w:pStyle w:val="Compact"/>
+              <w:jc w:val="left"/>
+            </w:pPr>
+            <w:r>
+              <w:t xml:space="preserve">Hours with a second GT, case 2 → 3</w:t>
+            </w:r>
+          </w:p>
+        </w:tc>
+        <w:tc>
+          <w:tcPr/>
+          <w:p>
+            <w:pPr>
+              <w:pStyle w:val="Compact"/>
+              <w:jc w:val="left"/>
+            </w:pPr>
+            <w:r>
+              <w:t xml:space="preserve">1,702 → 30</w:t>
+            </w:r>
+          </w:p>
+        </w:tc>
+        <w:tc>
+          <w:tcPr/>
+          <w:p>
+            <w:pPr>
+              <w:pStyle w:val="Compact"/>
+              <w:jc w:val="left"/>
+            </w:pPr>
+            <w:r>
+              <w:t xml:space="preserve">894 → 10</w:t>
+            </w:r>
+          </w:p>
+        </w:tc>
+      </w:tr>
+      <w:tr>
+        <w:tc>
+          <w:tcPr/>
+          <w:p>
+            <w:pPr>
+              <w:pStyle w:val="Compact"/>
+              <w:jc w:val="left"/>
+            </w:pPr>
+            <w:r>
+              <w:t xml:space="preserve">GT starts, case 2 → 3</w:t>
+            </w:r>
+          </w:p>
+        </w:tc>
+        <w:tc>
+          <w:tcPr/>
+          <w:p>
+            <w:pPr>
+              <w:pStyle w:val="Compact"/>
+              <w:jc w:val="left"/>
+            </w:pPr>
+            <w:r>
+              <w:t xml:space="preserve">149 → 6</w:t>
+            </w:r>
+          </w:p>
+        </w:tc>
+        <w:tc>
+          <w:tcPr/>
+          <w:p>
+            <w:pPr>
+              <w:pStyle w:val="Compact"/>
+              <w:jc w:val="left"/>
+            </w:pPr>
+            <w:r>
+              <w:t xml:space="preserve">120 → 1</w:t>
+            </w:r>
+          </w:p>
+        </w:tc>
+      </w:tr>
+      <w:tr>
+        <w:tc>
+          <w:tcPr/>
+          <w:p>
+            <w:pPr>
+              <w:pStyle w:val="Compact"/>
+              <w:jc w:val="left"/>
+            </w:pPr>
+            <w:r>
+              <w:t xml:space="preserve">GT low-load unit-hours, case 2 → 3</w:t>
+            </w:r>
+          </w:p>
+        </w:tc>
+        <w:tc>
+          <w:tcPr/>
+          <w:p>
+            <w:pPr>
+              <w:pStyle w:val="Compact"/>
+              <w:jc w:val="left"/>
+            </w:pPr>
+            <w:r>
+              <w:t xml:space="preserve">9,005 → 5,928 (−34 %)</w:t>
+            </w:r>
+          </w:p>
+        </w:tc>
+        <w:tc>
+          <w:tcPr/>
+          <w:p>
+            <w:pPr>
+              <w:pStyle w:val="Compact"/>
+              <w:jc w:val="left"/>
+            </w:pPr>
+            <w:r>
+              <w:t xml:space="preserve">6,401 → 4,763 (−26 %)</w:t>
+            </w:r>
+          </w:p>
+        </w:tc>
+      </w:tr>
+      <w:tr>
+        <w:tc>
+          <w:tcPr/>
+          <w:p>
+            <w:pPr>
+              <w:pStyle w:val="Compact"/>
+              <w:jc w:val="left"/>
+            </w:pPr>
+            <w:r>
+              <w:t xml:space="preserve">Lost production, case 3</w:t>
+            </w:r>
+          </w:p>
+        </w:tc>
+        <w:tc>
+          <w:tcPr/>
+          <w:p>
+            <w:pPr>
+              <w:pStyle w:val="Compact"/>
+              <w:jc w:val="left"/>
+            </w:pPr>
+            <w:r>
+              <w:t xml:space="preserve">0</w:t>
+            </w:r>
+          </w:p>
+        </w:tc>
+        <w:tc>
+          <w:tcPr/>
+          <w:p>
+            <w:pPr>
+              <w:pStyle w:val="Compact"/>
+              <w:jc w:val="left"/>
+            </w:pPr>
+            <w:r>
+              <w:t xml:space="preserve">0</w:t>
+            </w:r>
+          </w:p>
+        </w:tc>
+      </w:tr>
+    </w:tbl>
     <w:bookmarkEnd w:id="58"/>
+    <w:bookmarkStart w:id="62" w:name="results-of-the-four-cases"/>
+    <w:p>
+      <w:pPr>
+        <w:pStyle w:val="Heading3"/>
+      </w:pPr>
+      <w:r>
+        <w:t xml:space="preserve">9.2 Results of the four cases</w:t>
+      </w:r>
+    </w:p>
+    <w:p>
+      <w:pPr>
+        <w:pStyle w:val="FirstParagraph"/>
+      </w:pPr>
+      <w:r>
+        <w:t xml:space="preserve">Wind cuts emissions substantially at both sites, but less in Tanzania:</w:t>
+      </w:r>
+      <w:r>
+        <w:t xml:space="preserve"> </w:t>
+      </w:r>
+      <w:r>
+        <w:t xml:space="preserve">−43.2 % against −49.4 % with fixed demand (Figure 11, left). The weaker wind</w:t>
+      </w:r>
+      <w:r>
+        <w:t xml:space="preserve"> </w:t>
+      </w:r>
+      <w:r>
+        <w:t xml:space="preserve">delivers 57 GWh to the platform instead of 89 GWh, covering 42 % of the</w:t>
+      </w:r>
+      <w:r>
+        <w:t xml:space="preserve"> </w:t>
+      </w:r>
+      <w:r>
+        <w:t xml:space="preserve">annual demand against 54 % in the North Sea. Because the Tanzanian platform</w:t>
+      </w:r>
+      <w:r>
+        <w:t xml:space="preserve"> </w:t>
+      </w:r>
+      <w:r>
+        <w:t xml:space="preserve">needs less power, the gap is smaller than the capacity factors (29.6 % against</w:t>
+      </w:r>
+      <w:r>
+        <w:t xml:space="preserve"> </w:t>
+      </w:r>
+      <w:r>
+        <w:t xml:space="preserve">50.9 %) suggest.</w:t>
+      </w:r>
+    </w:p>
+    <w:p>
+      <w:pPr>
+        <w:pStyle w:val="BodyText"/>
+      </w:pPr>
+      <w:r>
+        <w:t xml:space="preserve">Flexible scheduling adds a further 2.6 kt/yr (4.5 % of case 2) in Tanzania.</w:t>
+      </w:r>
+      <w:r>
+        <w:t xml:space="preserve"> </w:t>
+      </w:r>
+      <w:r>
+        <w:t xml:space="preserve">That is about a third of the North Sea benefit in absolute terms and less than</w:t>
+      </w:r>
+      <w:r>
+        <w:t xml:space="preserve"> </w:t>
+      </w:r>
+      <w:r>
+        <w:t xml:space="preserve">half in relative terms, but still clearly positive, and again with</w:t>
+      </w:r>
+      <w:r>
+        <w:t xml:space="preserve"> </w:t>
+      </w:r>
+      <w:r>
+        <w:rPr>
+          <w:bCs/>
+          <w:b/>
+        </w:rPr>
+        <w:t xml:space="preserve">no lost</w:t>
+      </w:r>
+      <w:r>
+        <w:rPr>
+          <w:bCs/>
+          <w:b/>
+        </w:rPr>
+        <w:t xml:space="preserve"> </w:t>
+      </w:r>
+      <w:r>
+        <w:rPr>
+          <w:bCs/>
+          <w:b/>
+        </w:rPr>
+        <w:t xml:space="preserve">production</w:t>
+      </w:r>
+      <w:r>
+        <w:t xml:space="preserve">: the gas</w:t>
+      </w:r>
+      <w:r>
+        <w:t xml:space="preserve"> </w:t>
+      </w:r>
+      <w:r>
+        <w:t xml:space="preserve">delivered to shore over the year equals the sales rate, and the line pack</w:t>
+      </w:r>
+      <w:r>
+        <w:t xml:space="preserve"> </w:t>
+      </w:r>
+      <w:r>
+        <w:t xml:space="preserve">always returns to full by the end of the horizon. A 4 MW / 4 MWh battery</w:t>
+      </w:r>
+      <w:r>
+        <w:t xml:space="preserve"> </w:t>
+      </w:r>
+      <w:r>
+        <w:t xml:space="preserve">adds only 0.2 kt in Tanzania and 0.4 kt in the North Sea.</w:t>
+      </w:r>
+    </w:p>
+    <w:p>
+      <w:pPr>
+        <w:pStyle w:val="BodyText"/>
+      </w:pPr>
+      <w:r>
+        <w:t xml:space="preserve">The case 1 emissions differ more than the fuel use does (52.3 against</w:t>
+      </w:r>
+      <w:r>
+        <w:t xml:space="preserve"> </w:t>
+      </w:r>
+      <w:r>
+        <w:t xml:space="preserve">54.6 MSm³/yr). Tanzania needs less power, but its turbines are derated by the</w:t>
+      </w:r>
+      <w:r>
+        <w:t xml:space="preserve"> </w:t>
+      </w:r>
+      <w:r>
+        <w:t xml:space="preserve">heat and its fuel has a lower heating value. The CO2 difference therefore</w:t>
+      </w:r>
+      <w:r>
+        <w:t xml:space="preserve"> </w:t>
+      </w:r>
+      <w:r>
+        <w:t xml:space="preserve">comes mainly from the lower carbon content of the lean gas.</w:t>
+      </w:r>
+    </w:p>
+    <w:p>
+      <w:pPr>
+        <w:pStyle w:val="CaptionedFigure"/>
+      </w:pPr>
+      <w:r>
+        <w:drawing>
+          <wp:inline>
+            <wp:extent cx="5334000" cy="1505933"/>
+            <wp:effectExtent b="0" l="0" r="0" t="0"/>
+            <wp:docPr descr="Figure 11. North Sea vs Tanzania. Left: CO2 of cases 2–4 relative to case 1 at each site. Middle: monthly capacity factor of the same 30 MW wind farm (ERA5 2023). Right: CO2 saving of case 3 relative to case 2 against the size of the flexibility buffer (water injection deficit limit in the North Sea, line pack in Tanzania)." title="" id="60" name="Picture"/>
+            <a:graphic>
+              <a:graphicData uri="http://schemas.openxmlformats.org/drawingml/2006/picture">
+                <pic:pic>
+                  <pic:nvPicPr>
+                    <pic:cNvPr descr="results/comparison/site_comparison.png" id="61" name="Picture"/>
+                    <pic:cNvPicPr>
+                      <a:picLocks noChangeArrowheads="1" noChangeAspect="1"/>
+                    </pic:cNvPicPr>
+                  </pic:nvPicPr>
+                  <pic:blipFill>
+                    <a:blip r:embed="rId59"/>
+                    <a:stretch>
+                      <a:fillRect/>
+                    </a:stretch>
+                  </pic:blipFill>
+                  <pic:spPr bwMode="auto">
+                    <a:xfrm>
+                      <a:off x="0" y="0"/>
+                      <a:ext cx="5334000" cy="1505933"/>
+                    </a:xfrm>
+                    <a:prstGeom prst="rect">
+                      <a:avLst/>
+                    </a:prstGeom>
+                    <a:noFill/>
+                    <a:ln w="9525">
+                      <a:noFill/>
+                      <a:headEnd/>
+                      <a:tailEnd/>
+                    </a:ln>
+                  </pic:spPr>
+                </pic:pic>
+              </a:graphicData>
+            </a:graphic>
+          </wp:inline>
+        </w:drawing>
+      </w:r>
+    </w:p>
+    <w:p>
+      <w:pPr>
+        <w:pStyle w:val="ImageCaption"/>
+      </w:pPr>
+      <w:r>
+        <w:rPr>
+          <w:bCs/>
+          <w:b/>
+        </w:rPr>
+        <w:t xml:space="preserve">Figure 11.</w:t>
+      </w:r>
+      <w:r>
+        <w:t xml:space="preserve"> </w:t>
+      </w:r>
+      <w:r>
+        <w:t xml:space="preserve">North Sea vs Tanzania. Left: CO2 of cases 2–4 relative to case 1 at each site. Middle: monthly capacity factor of the same 30 MW wind farm (ERA5 2023). Right: CO2 saving of case 3 relative to case 2 against the size of the flexibility buffer (water injection deficit limit in the North Sea, line pack in Tanzania).</w:t>
+      </w:r>
+    </w:p>
+    <w:bookmarkEnd w:id="62"/>
+    <w:bookmarkStart w:id="66" w:name="same-mechanism-less-to-gain"/>
+    <w:p>
+      <w:pPr>
+        <w:pStyle w:val="Heading3"/>
+      </w:pPr>
+      <w:r>
+        <w:t xml:space="preserve">9.3 Same mechanism, less to gain</w:t>
+      </w:r>
+    </w:p>
+    <w:p>
+      <w:pPr>
+        <w:pStyle w:val="FirstParagraph"/>
+      </w:pPr>
+      <w:r>
+        <w:t xml:space="preserve">The flexibility saving comes from the same mechanism at both sites.</w:t>
+      </w:r>
+      <w:r>
+        <w:t xml:space="preserve"> </w:t>
+      </w:r>
+      <w:r>
+        <w:t xml:space="preserve">Postponing flexible load lets one gas turbine carry the platform in hours when</w:t>
+      </w:r>
+      <w:r>
+        <w:t xml:space="preserve"> </w:t>
+      </w:r>
+      <w:r>
+        <w:t xml:space="preserve">the wind is just too weak, instead of starting a second turbine that idles at</w:t>
+      </w:r>
+      <w:r>
+        <w:t xml:space="preserve"> </w:t>
+      </w:r>
+      <w:r>
+        <w:t xml:space="preserve">low load. In Tanzania, the hours with two GTs online fall from 894 to 10, the</w:t>
+      </w:r>
+      <w:r>
+        <w:t xml:space="preserve"> </w:t>
+      </w:r>
+      <w:r>
+        <w:t xml:space="preserve">starts from 120 to 1, and the GT low-load hours by 26 % (Table C1). The example</w:t>
+      </w:r>
+      <w:r>
+        <w:t xml:space="preserve"> </w:t>
+      </w:r>
+      <w:r>
+        <w:t xml:space="preserve">week (Figure 12) shows how this works on a gas platform. When the wind drops,</w:t>
+      </w:r>
+      <w:r>
+        <w:t xml:space="preserve"> </w:t>
+      </w:r>
+      <w:r>
+        <w:t xml:space="preserve">the platform lowers its gas production to about 70 % and pauses MEG</w:t>
+      </w:r>
+      <w:r>
+        <w:t xml:space="preserve"> </w:t>
+      </w:r>
+      <w:r>
+        <w:t xml:space="preserve">regeneration. When the wind returns, it produces at 110 % to refill the</w:t>
+      </w:r>
+      <w:r>
+        <w:t xml:space="preserve"> </w:t>
+      </w:r>
+      <w:r>
+        <w:t xml:space="preserve">pipeline. Production was above the sales rate in 4,287 hours and below it in</w:t>
+      </w:r>
+      <w:r>
+        <w:t xml:space="preserve"> </w:t>
+      </w:r>
+      <w:r>
+        <w:t xml:space="preserve">2,715 hours.</w:t>
+      </w:r>
+    </w:p>
+    <w:p>
+      <w:pPr>
+        <w:pStyle w:val="BodyText"/>
+      </w:pPr>
+      <w:r>
+        <w:t xml:space="preserve">The saving is smaller for two reasons.</w:t>
+      </w:r>
+    </w:p>
+    <w:p>
+      <w:pPr>
+        <w:numPr>
+          <w:ilvl w:val="0"/>
+          <w:numId w:val="1003"/>
+        </w:numPr>
+        <w:pStyle w:val="Compact"/>
+      </w:pPr>
+      <w:r>
+        <w:rPr>
+          <w:bCs/>
+          <w:b/>
+        </w:rPr>
+        <w:t xml:space="preserve">Less to avoid.</w:t>
+      </w:r>
+      <w:r>
+        <w:t xml:space="preserve"> </w:t>
+      </w:r>
+      <w:r>
+        <w:t xml:space="preserve">The Tanzanian design demand (15.4 MW) is only just</w:t>
+      </w:r>
+      <w:r>
+        <w:t xml:space="preserve"> </w:t>
+      </w:r>
+      <w:r>
+        <w:t xml:space="preserve">above what one derated GT can carry while holding 5 MW in reserve</w:t>
+      </w:r>
+      <w:r>
+        <w:t xml:space="preserve"> </w:t>
+      </w:r>
+      <w:r>
+        <w:t xml:space="preserve">(15.0 MW). Even with fixed demand, a second GT is therefore needed in</w:t>
+      </w:r>
+      <w:r>
+        <w:t xml:space="preserve"> </w:t>
+      </w:r>
+      <w:r>
+        <w:t xml:space="preserve">only 894 hours of the year, about half as often as in the North Sea</w:t>
+      </w:r>
+      <w:r>
+        <w:t xml:space="preserve"> </w:t>
+      </w:r>
+      <w:r>
+        <w:t xml:space="preserve">(1,702 h). Flexibility removes almost all of these hours at both sites,</w:t>
+      </w:r>
+      <w:r>
+        <w:t xml:space="preserve"> </w:t>
+      </w:r>
+      <w:r>
+        <w:t xml:space="preserve">but in Tanzania there are fewer to remove.</w:t>
+      </w:r>
+    </w:p>
+    <w:p>
+      <w:pPr>
+        <w:numPr>
+          <w:ilvl w:val="0"/>
+          <w:numId w:val="1003"/>
+        </w:numPr>
+        <w:pStyle w:val="Compact"/>
+      </w:pPr>
+      <w:r>
+        <w:rPr>
+          <w:bCs/>
+          <w:b/>
+        </w:rPr>
+        <w:t xml:space="preserve">A much smaller energy buffer.</w:t>
+      </w:r>
+      <w:r>
+        <w:t xml:space="preserve"> </w:t>
+      </w:r>
+      <w:r>
+        <w:t xml:space="preserve">Cutting production to its minimum lowers</w:t>
+      </w:r>
+      <w:r>
+        <w:t xml:space="preserve"> </w:t>
+      </w:r>
+      <w:r>
+        <w:t xml:space="preserve">the Tanzanian demand by 6.0 MW (North Sea injection lever: 9.6 MW). But</w:t>
+      </w:r>
+      <w:r>
+        <w:t xml:space="preserve"> </w:t>
+      </w:r>
+      <w:r>
+        <w:t xml:space="preserve">the line pack holds only 3.6 h of full-rate production, so only about</w:t>
+      </w:r>
+      <w:r>
+        <w:t xml:space="preserve"> </w:t>
+      </w:r>
+      <w:r>
+        <w:t xml:space="preserve">45 MWh of electricity can be postponed. The 48 h MEG tank adds about</w:t>
+      </w:r>
+      <w:r>
+        <w:t xml:space="preserve"> </w:t>
+      </w:r>
+      <w:r>
+        <w:t xml:space="preserve">5 MWh, because regeneration uses only 0.1 MW of electricity; its 1 MW of</w:t>
+      </w:r>
+      <w:r>
+        <w:t xml:space="preserve"> </w:t>
+      </w:r>
+      <w:r>
+        <w:t xml:space="preserve">heat comes from turbine waste heat, which is always in surplus. The North</w:t>
+      </w:r>
+      <w:r>
+        <w:t xml:space="preserve"> </w:t>
+      </w:r>
+      <w:r>
+        <w:t xml:space="preserve">Sea injection buffer of 72 h holds about 660 MWh. Tanzanian flexibility</w:t>
+      </w:r>
+      <w:r>
+        <w:t xml:space="preserve"> </w:t>
+      </w:r>
+      <w:r>
+        <w:t xml:space="preserve">can bridge short lulls of a few hours, but it cannot move much wind energy</w:t>
+      </w:r>
+      <w:r>
+        <w:t xml:space="preserve"> </w:t>
+      </w:r>
+      <w:r>
+        <w:t xml:space="preserve">from windy to calm periods. Wind curtailment therefore falls by only</w:t>
+      </w:r>
+      <w:r>
+        <w:t xml:space="preserve"> </w:t>
+      </w:r>
+      <w:r>
+        <w:t xml:space="preserve">1.6 GWh (North Sea: 5.7 GWh).</w:t>
+      </w:r>
+    </w:p>
+    <w:p>
+      <w:pPr>
+        <w:pStyle w:val="FirstParagraph"/>
+      </w:pPr>
+      <w:r>
+        <w:t xml:space="preserve">The line-pack sensitivity confirms this (Figure 11, right; Figure 13).</w:t>
+      </w:r>
+    </w:p>
+    <w:tbl>
+      <w:tblPr>
+        <w:tblStyle w:val="Table"/>
+        <w:tblW w:type="auto" w:w="0"/>
+        <w:tblLook w:firstRow="1" w:lastRow="0" w:firstColumn="0" w:lastColumn="0" w:noHBand="0" w:noVBand="0" w:val="0020"/>
+        <w:jc w:val="start"/>
+        <w:tblBorders>
+          <w:top w:val="single" w:sz="4" w:space="0" w:color="808080"/>
+          <w:left w:val="single" w:sz="4" w:space="0" w:color="808080"/>
+          <w:bottom w:val="single" w:sz="4" w:space="0" w:color="808080"/>
+          <w:right w:val="single" w:sz="4" w:space="0" w:color="808080"/>
+          <w:insideH w:val="single" w:sz="4" w:space="0" w:color="808080"/>
+          <w:insideV w:val="single" w:sz="4" w:space="0" w:color="808080"/>
+        </w:tblBorders>
+      </w:tblPr>
+      <w:tblGrid>
+        <w:gridCol w:w="1584"/>
+        <w:gridCol w:w="1584"/>
+        <w:gridCol w:w="1584"/>
+        <w:gridCol w:w="1584"/>
+        <w:gridCol w:w="1584"/>
+      </w:tblGrid>
+      <w:tr>
+        <w:trPr>
+          <w:tblHeader w:val="true"/>
+        </w:trPr>
+        <w:tc>
+          <w:tcPr/>
+          <w:p>
+            <w:pPr>
+              <w:pStyle w:val="Compact"/>
+              <w:jc w:val="left"/>
+            </w:pPr>
+            <w:r>
+              <w:t xml:space="preserve">Line pack</w:t>
+            </w:r>
+          </w:p>
+        </w:tc>
+        <w:tc>
+          <w:tcPr/>
+          <w:p>
+            <w:pPr>
+              <w:pStyle w:val="Compact"/>
+              <w:jc w:val="left"/>
+            </w:pPr>
+            <w:r>
+              <w:t xml:space="preserve">0 h</w:t>
+            </w:r>
+          </w:p>
+        </w:tc>
+        <w:tc>
+          <w:tcPr/>
+          <w:p>
+            <w:pPr>
+              <w:pStyle w:val="Compact"/>
+              <w:jc w:val="left"/>
+            </w:pPr>
+            <w:r>
+              <w:t xml:space="preserve">1.8 h</w:t>
+            </w:r>
+          </w:p>
+        </w:tc>
+        <w:tc>
+          <w:tcPr/>
+          <w:p>
+            <w:pPr>
+              <w:pStyle w:val="Compact"/>
+              <w:jc w:val="left"/>
+            </w:pPr>
+            <w:r>
+              <w:t xml:space="preserve">3.6 h</w:t>
+            </w:r>
+          </w:p>
+        </w:tc>
+        <w:tc>
+          <w:tcPr/>
+          <w:p>
+            <w:pPr>
+              <w:pStyle w:val="Compact"/>
+              <w:jc w:val="left"/>
+            </w:pPr>
+            <w:r>
+              <w:t xml:space="preserve">7.2 h</w:t>
+            </w:r>
+          </w:p>
+        </w:tc>
+      </w:tr>
+      <w:tr>
+        <w:tc>
+          <w:tcPr/>
+          <w:p>
+            <w:pPr>
+              <w:pStyle w:val="Compact"/>
+              <w:jc w:val="left"/>
+            </w:pPr>
+            <w:r>
+              <w:t xml:space="preserve">Saving vs case 2</w:t>
+            </w:r>
+          </w:p>
+        </w:tc>
+        <w:tc>
+          <w:tcPr/>
+          <w:p>
+            <w:pPr>
+              <w:pStyle w:val="Compact"/>
+              <w:jc w:val="left"/>
+            </w:pPr>
+            <w:r>
+              <w:t xml:space="preserve">0.3 %</w:t>
+            </w:r>
+          </w:p>
+        </w:tc>
+        <w:tc>
+          <w:tcPr/>
+          <w:p>
+            <w:pPr>
+              <w:pStyle w:val="Compact"/>
+              <w:jc w:val="left"/>
+            </w:pPr>
+            <w:r>
+              <w:t xml:space="preserve">4.2 %</w:t>
+            </w:r>
+          </w:p>
+        </w:tc>
+        <w:tc>
+          <w:tcPr/>
+          <w:p>
+            <w:pPr>
+              <w:pStyle w:val="Compact"/>
+              <w:jc w:val="left"/>
+            </w:pPr>
+            <w:r>
+              <w:t xml:space="preserve">4.5 %</w:t>
+            </w:r>
+          </w:p>
+        </w:tc>
+        <w:tc>
+          <w:tcPr/>
+          <w:p>
+            <w:pPr>
+              <w:pStyle w:val="Compact"/>
+              <w:jc w:val="left"/>
+            </w:pPr>
+            <w:r>
+              <w:t xml:space="preserve">4.9 %</w:t>
+            </w:r>
+          </w:p>
+        </w:tc>
+      </w:tr>
+    </w:tbl>
+    <w:p>
+      <w:pPr>
+        <w:pStyle w:val="BodyText"/>
+      </w:pPr>
+      <w:r>
+        <w:t xml:space="preserve">With no line pack, only MEG regeneration can be moved, and the benefit almost</w:t>
+      </w:r>
+      <w:r>
+        <w:t xml:space="preserve"> </w:t>
+      </w:r>
+      <w:r>
+        <w:t xml:space="preserve">disappears: 122 GT starts remain, as with fixed demand. The first 1.8 h of</w:t>
+      </w:r>
+      <w:r>
+        <w:t xml:space="preserve"> </w:t>
+      </w:r>
+      <w:r>
+        <w:t xml:space="preserve">line pack gives most of the benefit. In the North Sea, likewise, 24 h of</w:t>
+      </w:r>
+      <w:r>
+        <w:t xml:space="preserve"> </w:t>
+      </w:r>
+      <w:r>
+        <w:t xml:space="preserve">injection deficit gave the full result. Allowing a wider pipeline pressure</w:t>
+      </w:r>
+      <w:r>
+        <w:t xml:space="preserve"> </w:t>
+      </w:r>
+      <w:r>
+        <w:t xml:space="preserve">swing would raise the Tanzanian benefit only slowly.</w:t>
+      </w:r>
+    </w:p>
+    <w:p>
+      <w:pPr>
+        <w:pStyle w:val="CaptionedFigure"/>
+      </w:pPr>
+      <w:r>
+        <w:drawing>
+          <wp:inline>
+            <wp:extent cx="5334000" cy="4365500"/>
+            <wp:effectExtent b="0" l="0" r="0" t="0"/>
+            <wp:docPr descr="Figure 12. Tanzania, example week (week with the median fuel saving). Top two panels: power supply with fixed and with flexible demand. Bottom: gas production and MEG regeneration as % of design. Production above 100 % refills the pipeline line pack." title="" id="64" name="Picture"/>
+            <a:graphic>
+              <a:graphicData uri="http://schemas.openxmlformats.org/drawingml/2006/picture">
+                <pic:pic>
+                  <pic:nvPicPr>
+                    <pic:cNvPr descr="results/tanzania/paper/fig05_example_week.png" id="65" name="Picture"/>
+                    <pic:cNvPicPr>
+                      <a:picLocks noChangeArrowheads="1" noChangeAspect="1"/>
+                    </pic:cNvPicPr>
+                  </pic:nvPicPr>
+                  <pic:blipFill>
+                    <a:blip r:embed="rId63"/>
+                    <a:stretch>
+                      <a:fillRect/>
+                    </a:stretch>
+                  </pic:blipFill>
+                  <pic:spPr bwMode="auto">
+                    <a:xfrm>
+                      <a:off x="0" y="0"/>
+                      <a:ext cx="5334000" cy="4365500"/>
+                    </a:xfrm>
+                    <a:prstGeom prst="rect">
+                      <a:avLst/>
+                    </a:prstGeom>
+                    <a:noFill/>
+                    <a:ln w="9525">
+                      <a:noFill/>
+                      <a:headEnd/>
+                      <a:tailEnd/>
+                    </a:ln>
+                  </pic:spPr>
+                </pic:pic>
+              </a:graphicData>
+            </a:graphic>
+          </wp:inline>
+        </w:drawing>
+      </w:r>
+    </w:p>
+    <w:p>
+      <w:pPr>
+        <w:pStyle w:val="ImageCaption"/>
+      </w:pPr>
+      <w:r>
+        <w:rPr>
+          <w:bCs/>
+          <w:b/>
+        </w:rPr>
+        <w:t xml:space="preserve">Figure 12.</w:t>
+      </w:r>
+      <w:r>
+        <w:t xml:space="preserve"> </w:t>
+      </w:r>
+      <w:r>
+        <w:t xml:space="preserve">Tanzania, example week (week with the median fuel saving). Top two panels: power supply with fixed and with flexible demand. Bottom: gas production and MEG regeneration as % of design. Production above 100 % refills the pipeline line pack.</w:t>
+      </w:r>
+    </w:p>
+    <w:bookmarkEnd w:id="66"/>
+    <w:bookmarkStart w:id="70" w:name="sensitivities-in-tanzania"/>
+    <w:p>
+      <w:pPr>
+        <w:pStyle w:val="Heading3"/>
+      </w:pPr>
+      <w:r>
+        <w:t xml:space="preserve">9.4 Sensitivities in Tanzania</w:t>
+      </w:r>
+    </w:p>
+    <w:p>
+      <w:pPr>
+        <w:pStyle w:val="FirstParagraph"/>
+      </w:pPr>
+      <w:r>
+        <w:t xml:space="preserve">The other sensitivities behave as in the North Sea (Figure 13):</w:t>
+      </w:r>
+    </w:p>
+    <w:p>
+      <w:pPr>
+        <w:numPr>
+          <w:ilvl w:val="0"/>
+          <w:numId w:val="1004"/>
+        </w:numPr>
+        <w:pStyle w:val="Compact"/>
+      </w:pPr>
+      <w:r>
+        <w:rPr>
+          <w:bCs/>
+          <w:b/>
+        </w:rPr>
+        <w:t xml:space="preserve">Wind farm size.</w:t>
+      </w:r>
+      <w:r>
+        <w:t xml:space="preserve"> </w:t>
+      </w:r>
+      <w:r>
+        <w:t xml:space="preserve">Each extra 15 MW turbine saves less: case 3 emissions</w:t>
+      </w:r>
+      <w:r>
+        <w:t xml:space="preserve"> </w:t>
+      </w:r>
+      <w:r>
+        <w:t xml:space="preserve">are 64.5, 55.2, 50.3 and 47.3 kt/yr for one to four turbines. The</w:t>
+      </w:r>
+      <w:r>
+        <w:t xml:space="preserve"> </w:t>
+      </w:r>
+      <w:r>
+        <w:t xml:space="preserve">flexibility benefit stays at about 2.6–2.8 kt whatever the farm size,</w:t>
+      </w:r>
+      <w:r>
+        <w:t xml:space="preserve"> </w:t>
+      </w:r>
+      <w:r>
+        <w:t xml:space="preserve">because it is limited by the line pack, not by the wind.</w:t>
+      </w:r>
+    </w:p>
+    <w:p>
+      <w:pPr>
+        <w:numPr>
+          <w:ilvl w:val="0"/>
+          <w:numId w:val="1004"/>
+        </w:numPr>
+        <w:pStyle w:val="Compact"/>
+      </w:pPr>
+      <w:r>
+        <w:rPr>
+          <w:bCs/>
+          <w:b/>
+        </w:rPr>
+        <w:t xml:space="preserve">CO2 price and gas price</w:t>
+      </w:r>
+      <w:r>
+        <w:t xml:space="preserve"> </w:t>
+      </w:r>
+      <w:r>
+        <w:t xml:space="preserve">have no effect (55.2 kt in all runs, from no</w:t>
+      </w:r>
+      <w:r>
+        <w:t xml:space="preserve"> </w:t>
+      </w:r>
+      <w:r>
+        <w:t xml:space="preserve">carbon price up to NOK 2/kg). The</w:t>
+      </w:r>
+      <w:r>
+        <w:t xml:space="preserve"> </w:t>
+      </w:r>
+      <w:r>
+        <w:t xml:space="preserve">scheduler already minimises fuel, so a carbon price changes the cost but</w:t>
+      </w:r>
+      <w:r>
+        <w:t xml:space="preserve"> </w:t>
+      </w:r>
+      <w:r>
+        <w:t xml:space="preserve">not the operation. A carbon price is therefore not needed for this</w:t>
+      </w:r>
+      <w:r>
+        <w:t xml:space="preserve"> </w:t>
+      </w:r>
+      <w:r>
+        <w:t xml:space="preserve">flexibility to pay off: it saves fuel that can be sold as LNG.</w:t>
+      </w:r>
+    </w:p>
+    <w:p>
+      <w:pPr>
+        <w:numPr>
+          <w:ilvl w:val="0"/>
+          <w:numId w:val="1004"/>
+        </w:numPr>
+        <w:pStyle w:val="Compact"/>
+      </w:pPr>
+      <w:r>
+        <w:rPr>
+          <w:bCs/>
+          <w:b/>
+        </w:rPr>
+        <w:t xml:space="preserve">Operating practice</w:t>
+      </w:r>
+      <w:r>
+        <w:t xml:space="preserve"> </w:t>
+      </w:r>
+      <w:r>
+        <w:t xml:space="preserve">dominates. Keeping two GTs online removes almost</w:t>
+      </w:r>
+      <w:r>
+        <w:t xml:space="preserve"> </w:t>
+      </w:r>
+      <w:r>
+        <w:t xml:space="preserve">all of the benefit of wind (79.2 kt in case 2, 78.4 kt in case 3).</w:t>
+      </w:r>
+    </w:p>
+    <w:p>
+      <w:pPr>
+        <w:numPr>
+          <w:ilvl w:val="0"/>
+          <w:numId w:val="1004"/>
+        </w:numPr>
+        <w:pStyle w:val="Compact"/>
+      </w:pPr>
+      <w:r>
+        <w:rPr>
+          <w:bCs/>
+          <w:b/>
+        </w:rPr>
+        <w:t xml:space="preserve">No GT online.</w:t>
+      </w:r>
+      <w:r>
+        <w:t xml:space="preserve"> </w:t>
+      </w:r>
+      <w:r>
+        <w:t xml:space="preserve">Unlike the North Sea, allowing all GTs to stop with an</w:t>
+      </w:r>
+      <w:r>
+        <w:t xml:space="preserve"> </w:t>
+      </w:r>
+      <w:r>
+        <w:t xml:space="preserve">8 MW / 8 MWh battery is</w:t>
+      </w:r>
+      <w:r>
+        <w:t xml:space="preserve"> </w:t>
+      </w:r>
+      <w:r>
+        <w:rPr>
+          <w:bCs/>
+          <w:b/>
+        </w:rPr>
+        <w:t xml:space="preserve">not feasible</w:t>
+      </w:r>
+      <w:r>
+        <w:t xml:space="preserve"> </w:t>
+      </w:r>
+      <w:r>
+        <w:t xml:space="preserve">in Tanzania: it leaves 52 MWh of</w:t>
+      </w:r>
+      <w:r>
+        <w:t xml:space="preserve"> </w:t>
+      </w:r>
+      <w:r>
+        <w:t xml:space="preserve">demand unmet over the year and needs 217 GT starts. Long calms and a weak</w:t>
+      </w:r>
+      <w:r>
+        <w:t xml:space="preserve"> </w:t>
+      </w:r>
+      <w:r>
+        <w:t xml:space="preserve">resource mean that a battery of this size cannot always bridge the start</w:t>
+      </w:r>
+      <w:r>
+        <w:t xml:space="preserve"> </w:t>
+      </w:r>
+      <w:r>
+        <w:t xml:space="preserve">of a gas turbine. The result (46.4 kt) is marked in Figure 13 and is not a</w:t>
+      </w:r>
+      <w:r>
+        <w:t xml:space="preserve"> </w:t>
+      </w:r>
+      <w:r>
+        <w:t xml:space="preserve">valid design.</w:t>
+      </w:r>
+    </w:p>
+    <w:p>
+      <w:pPr>
+        <w:numPr>
+          <w:ilvl w:val="0"/>
+          <w:numId w:val="1004"/>
+        </w:numPr>
+        <w:pStyle w:val="Compact"/>
+      </w:pPr>
+      <w:r>
+        <w:rPr>
+          <w:bCs/>
+          <w:b/>
+        </w:rPr>
+        <w:t xml:space="preserve">Gas turbine fleet.</w:t>
+      </w:r>
+      <w:r>
+        <w:t xml:space="preserve"> </w:t>
+      </w:r>
+      <w:r>
+        <w:t xml:space="preserve">Replacing one main GT by a smaller unit saves</w:t>
+      </w:r>
+      <w:r>
+        <w:t xml:space="preserve"> </w:t>
+      </w:r>
+      <w:r>
+        <w:t xml:space="preserve">1.1 kt more but needs 43 starts instead of 1.</w:t>
+      </w:r>
+    </w:p>
+    <w:p>
+      <w:pPr>
+        <w:pStyle w:val="FirstParagraph"/>
+      </w:pPr>
+      <w:r>
+        <w:t xml:space="preserve">Results that differ only by solver tolerance (for example the base case</w:t>
+      </w:r>
+      <w:r>
+        <w:t xml:space="preserve"> </w:t>
+      </w:r>
+      <w:r>
+        <w:t xml:space="preserve">repeated within a sensitivity group) agree within 0.1 kt.</w:t>
+      </w:r>
+    </w:p>
+    <w:p>
+      <w:pPr>
+        <w:pStyle w:val="CaptionedFigure"/>
+      </w:pPr>
+      <w:r>
+        <w:drawing>
+          <wp:inline>
+            <wp:extent cx="5334000" cy="4492807"/>
+            <wp:effectExtent b="0" l="0" r="0" t="0"/>
+            <wp:docPr descr="Figure 13. Tanzania, sensitivity of annual CO2 (cases 2–4). A red ring marks a run with unmet demand." title="" id="68" name="Picture"/>
+            <a:graphic>
+              <a:graphicData uri="http://schemas.openxmlformats.org/drawingml/2006/picture">
+                <pic:pic>
+                  <pic:nvPicPr>
+                    <pic:cNvPr descr="results/tanzania/paper/fig09_sensitivity_overview.png" id="69" name="Picture"/>
+                    <pic:cNvPicPr>
+                      <a:picLocks noChangeArrowheads="1" noChangeAspect="1"/>
+                    </pic:cNvPicPr>
+                  </pic:nvPicPr>
+                  <pic:blipFill>
+                    <a:blip r:embed="rId67"/>
+                    <a:stretch>
+                      <a:fillRect/>
+                    </a:stretch>
+                  </pic:blipFill>
+                  <pic:spPr bwMode="auto">
+                    <a:xfrm>
+                      <a:off x="0" y="0"/>
+                      <a:ext cx="5334000" cy="4492807"/>
+                    </a:xfrm>
+                    <a:prstGeom prst="rect">
+                      <a:avLst/>
+                    </a:prstGeom>
+                    <a:noFill/>
+                    <a:ln w="9525">
+                      <a:noFill/>
+                      <a:headEnd/>
+                      <a:tailEnd/>
+                    </a:ln>
+                  </pic:spPr>
+                </pic:pic>
+              </a:graphicData>
+            </a:graphic>
+          </wp:inline>
+        </w:drawing>
+      </w:r>
+    </w:p>
+    <w:p>
+      <w:pPr>
+        <w:pStyle w:val="ImageCaption"/>
+      </w:pPr>
+      <w:r>
+        <w:rPr>
+          <w:bCs/>
+          <w:b/>
+        </w:rPr>
+        <w:t xml:space="preserve">Figure 13.</w:t>
+      </w:r>
+      <w:r>
+        <w:t xml:space="preserve"> </w:t>
+      </w:r>
+      <w:r>
+        <w:t xml:space="preserve">Tanzania, sensitivity of annual CO2 (cases 2–4). A red ring marks a run with unmet demand.</w:t>
+      </w:r>
+    </w:p>
+    <w:bookmarkEnd w:id="70"/>
+    <w:bookmarkStart w:id="71" w:name="what-the-comparison-shows"/>
+    <w:p>
+      <w:pPr>
+        <w:pStyle w:val="Heading3"/>
+      </w:pPr>
+      <w:r>
+        <w:t xml:space="preserve">9.5 What the comparison shows</w:t>
+      </w:r>
+    </w:p>
+    <w:p>
+      <w:pPr>
+        <w:numPr>
+          <w:ilvl w:val="0"/>
+          <w:numId w:val="1005"/>
+        </w:numPr>
+        <w:pStyle w:val="Compact"/>
+      </w:pPr>
+      <w:r>
+        <w:t xml:space="preserve">The main finding holds at a tropical gas platform with a much weaker wind</w:t>
+      </w:r>
+      <w:r>
+        <w:t xml:space="preserve"> </w:t>
+      </w:r>
+      <w:r>
+        <w:t xml:space="preserve">resource and a different process. Scheduling flexible consumers cuts CO2</w:t>
+      </w:r>
+      <w:r>
+        <w:t xml:space="preserve"> </w:t>
+      </w:r>
+      <w:r>
+        <w:t xml:space="preserve">further without lost production, mainly by avoiding a second running gas</w:t>
+      </w:r>
+      <w:r>
+        <w:t xml:space="preserve"> </w:t>
+      </w:r>
+      <w:r>
+        <w:t xml:space="preserve">turbine.</w:t>
+      </w:r>
+    </w:p>
+    <w:p>
+      <w:pPr>
+        <w:numPr>
+          <w:ilvl w:val="0"/>
+          <w:numId w:val="1005"/>
+        </w:numPr>
+        <w:pStyle w:val="Compact"/>
+      </w:pPr>
+      <w:r>
+        <w:t xml:space="preserve">The size of the benefit depends on how many hours of load the platform</w:t>
+      </w:r>
+      <w:r>
+        <w:t xml:space="preserve"> </w:t>
+      </w:r>
+      <w:r>
+        <w:t xml:space="preserve">can postpone, not on how many megawatts it can shed. An oil platform with</w:t>
+      </w:r>
+      <w:r>
+        <w:t xml:space="preserve"> </w:t>
+      </w:r>
+      <w:r>
+        <w:t xml:space="preserve">water injection has a buffer of days. A gas platform has only the line</w:t>
+      </w:r>
+      <w:r>
+        <w:t xml:space="preserve"> </w:t>
+      </w:r>
+      <w:r>
+        <w:t xml:space="preserve">pack of its export pipeline, a few hours. Because this platform also</w:t>
+      </w:r>
+      <w:r>
+        <w:t xml:space="preserve"> </w:t>
+      </w:r>
+      <w:r>
+        <w:t xml:space="preserve">needs a second turbine less often in the first place, the benefit is less</w:t>
+      </w:r>
+      <w:r>
+        <w:t xml:space="preserve"> </w:t>
+      </w:r>
+      <w:r>
+        <w:t xml:space="preserve">than half as large (4.5 % against 11 % of case 2 emissions).</w:t>
+      </w:r>
+    </w:p>
+    <w:p>
+      <w:pPr>
+        <w:numPr>
+          <w:ilvl w:val="0"/>
+          <w:numId w:val="1005"/>
+        </w:numPr>
+        <w:pStyle w:val="Compact"/>
+      </w:pPr>
+      <w:r>
+        <w:t xml:space="preserve">Wind alone reduces emissions less in Tanzania (−43 % against −49 %), and</w:t>
+      </w:r>
+      <w:r>
+        <w:t xml:space="preserve"> </w:t>
+      </w:r>
+      <w:r>
+        <w:t xml:space="preserve">its strong seasonal pattern leaves December almost without wind.</w:t>
+      </w:r>
+    </w:p>
+    <w:p>
+      <w:pPr>
+        <w:numPr>
+          <w:ilvl w:val="0"/>
+          <w:numId w:val="1005"/>
+        </w:numPr>
+        <w:pStyle w:val="Compact"/>
+      </w:pPr>
+      <w:r>
+        <w:t xml:space="preserve">With the small Tanzanian excise duty of 2025 (about NOK 0.09/kg, about 5 %</w:t>
+      </w:r>
+      <w:r>
+        <w:t xml:space="preserve"> </w:t>
+      </w:r>
+      <w:r>
+        <w:t xml:space="preserve">of the Norwegian 2030 price), wind and flexibility are justified in Tanzania</w:t>
+      </w:r>
+      <w:r>
+        <w:t xml:space="preserve"> </w:t>
+      </w:r>
+      <w:r>
+        <w:t xml:space="preserve">mainly by the gas they save for sale, not by avoided CO2 cost.</w:t>
+      </w:r>
+    </w:p>
+    <w:p>
+      <w:pPr>
+        <w:pStyle w:val="FirstParagraph"/>
+      </w:pPr>
+      <w:r>
+        <w:rPr>
+          <w:bCs/>
+          <w:b/>
+        </w:rPr>
+        <w:t xml:space="preserve">Limitations specific to this case.</w:t>
+      </w:r>
+      <w:r>
+        <w:t xml:space="preserve"> </w:t>
+      </w:r>
+      <w:r>
+        <w:t xml:space="preserve">The processing platform is</w:t>
+      </w:r>
+      <w:r>
+        <w:t xml:space="preserve"> </w:t>
+      </w:r>
+      <w:r>
+        <w:t xml:space="preserve">hypothetical: the planned development is subsea-to-shore. The gas composition,</w:t>
+      </w:r>
+      <w:r>
+        <w:t xml:space="preserve"> </w:t>
+      </w:r>
+      <w:r>
+        <w:t xml:space="preserve">pipeline size and pressures, and the production limits are assumptions. 43 of</w:t>
+      </w:r>
+      <w:r>
+        <w:t xml:space="preserve"> </w:t>
+      </w:r>
+      <w:r>
+        <w:t xml:space="preserve">115 parameters remain assumptions, 22 of them specific to Tanzania</w:t>
+      </w:r>
+      <w:r>
+        <w:t xml:space="preserve"> </w:t>
+      </w:r>
+      <w:r>
+        <w:t xml:space="preserve">(</w:t>
+      </w:r>
+      <w:r>
+        <w:rPr>
+          <w:rStyle w:val="VerbatimChar"/>
+        </w:rPr>
+        <w:t xml:space="preserve">docs/verification/tanzania_assumptions.md</w:t>
+      </w:r>
+      <w:r>
+        <w:t xml:space="preserve">). The TEG and MEG duties were</w:t>
+      </w:r>
+      <w:r>
+        <w:t xml:space="preserve"> </w:t>
+      </w:r>
+      <w:r>
+        <w:t xml:space="preserve">checked with NeqSim water-content calculations. No operating data are available for</w:t>
+      </w:r>
+      <w:r>
+        <w:t xml:space="preserve"> </w:t>
+      </w:r>
+      <w:r>
+        <w:t xml:space="preserve">validation; the wind input is checked only qualitatively against coastal</w:t>
+      </w:r>
+      <w:r>
+        <w:t xml:space="preserve"> </w:t>
+      </w:r>
+      <w:r>
+        <w:t xml:space="preserve">station measurements and the ESMAP offshore-wind maps. ESMAP counts technical</w:t>
+      </w:r>
+      <w:r>
+        <w:t xml:space="preserve"> </w:t>
+      </w:r>
+      <w:r>
+        <w:t xml:space="preserve">potential only where the mean wind speed is at least 7 m/s, slightly above</w:t>
+      </w:r>
+      <w:r>
+        <w:t xml:space="preserve"> </w:t>
+      </w:r>
+      <w:r>
+        <w:t xml:space="preserve">the 6.4 m/s at 100 m that ERA5 gives here. Reanalysis data may underestimate</w:t>
+      </w:r>
+      <w:r>
+        <w:t xml:space="preserve"> </w:t>
+      </w:r>
+      <w:r>
+        <w:t xml:space="preserve">offshore wind speeds, so the Tanzanian wind results are likely conservative.</w:t>
+      </w:r>
+    </w:p>
+    <w:bookmarkEnd w:id="71"/>
+    <w:bookmarkEnd w:id="72"/>
+    <w:bookmarkEnd w:id="73"/>
     <w:sectPr/>
   </w:body>
 </w:document>
@@ -4104,6 +6137,42 @@
     <w:abstractNumId w:val="991"/>
   </w:num>
   <w:num w:numId="1002">
+    <w:abstractNumId w:val="99411"/>
+    <w:lvlOverride w:ilvl="0">
+      <w:startOverride w:val="1"/>
+    </w:lvlOverride>
+    <w:lvlOverride w:ilvl="1">
+      <w:startOverride w:val="1"/>
+    </w:lvlOverride>
+    <w:lvlOverride w:ilvl="2">
+      <w:startOverride w:val="1"/>
+    </w:lvlOverride>
+    <w:lvlOverride w:ilvl="3">
+      <w:startOverride w:val="1"/>
+    </w:lvlOverride>
+    <w:lvlOverride w:ilvl="4">
+      <w:startOverride w:val="1"/>
+    </w:lvlOverride>
+    <w:lvlOverride w:ilvl="5">
+      <w:startOverride w:val="1"/>
+    </w:lvlOverride>
+    <w:lvlOverride w:ilvl="6">
+      <w:startOverride w:val="1"/>
+    </w:lvlOverride>
+    <w:lvlOverride w:ilvl="7">
+      <w:startOverride w:val="1"/>
+    </w:lvlOverride>
+    <w:lvlOverride w:ilvl="8">
+      <w:startOverride w:val="1"/>
+    </w:lvlOverride>
+  </w:num>
+  <w:num w:numId="1003">
+    <w:abstractNumId w:val="991"/>
+  </w:num>
+  <w:num w:numId="1004">
+    <w:abstractNumId w:val="991"/>
+  </w:num>
+  <w:num w:numId="1005">
     <w:abstractNumId w:val="99411"/>
     <w:lvlOverride w:ilvl="0">
       <w:startOverride w:val="1"/>

</xml_diff>

<commit_message>
Results: Tanzania point in the summary; renumber Figures 7 and 8 to text order
The water-injection mechanism figure is now Figure 7 (fig07_injection_mechanism)
and monthly CO2 is Figure 8 (fig08_monthly_co2), for both sites.
</commit_message>
<xml_diff>
--- a/docs/thesis/results.docx
+++ b/docs/thesis/results.docx
@@ -1520,7 +1520,7 @@
         <w:t xml:space="preserve"> </w:t>
       </w:r>
       <w:r>
-        <w:t xml:space="preserve">met (Figure 8). Injection rate and available wind are clearly correlated</w:t>
+        <w:t xml:space="preserve">met (Figure 7). Injection rate and available wind are clearly correlated</w:t>
       </w:r>
       <w:r>
         <w:t xml:space="preserve"> </w:t>
@@ -1546,7 +1546,7 @@
         <w:t xml:space="preserve"> </w:t>
       </w:r>
       <w:r>
-        <w:t xml:space="preserve">and never exceeds 25.2 h, well below the 72 h allowed (Figure 8, right). The</w:t>
+        <w:t xml:space="preserve">and never exceeds 25.2 h, well below the 72 h allowed (Figure 7, right). The</w:t>
       </w:r>
       <w:r>
         <w:t xml:space="preserve"> </w:t>
@@ -1720,12 +1720,12 @@
           <wp:inline>
             <wp:extent cx="5334000" cy="2037906"/>
             <wp:effectExtent b="0" l="0" r="0" t="0"/>
-            <wp:docPr descr="Figure 8. Left: water-injection rate against available wind in case 3 (mean and 10–90 % range of hours). Right: distribution of the injection deficit (dashed: 72 h limit)." title="" id="42" name="Picture"/>
+            <wp:docPr descr="Figure 7. Left: water-injection rate against available wind in case 3 (mean and 10–90 % range of hours). Right: distribution of the injection deficit (dashed: 72 h limit)." title="" id="42" name="Picture"/>
             <a:graphic>
               <a:graphicData uri="http://schemas.openxmlformats.org/drawingml/2006/picture">
                 <pic:pic>
                   <pic:nvPicPr>
-                    <pic:cNvPr descr="results/paper/fig08_injection_mechanism.png" id="43" name="Picture"/>
+                    <pic:cNvPr descr="results/paper/fig07_injection_mechanism.png" id="43" name="Picture"/>
                     <pic:cNvPicPr>
                       <a:picLocks noChangeArrowheads="1" noChangeAspect="1"/>
                     </pic:cNvPicPr>
@@ -1767,7 +1767,7 @@
           <w:bCs/>
           <w:b/>
         </w:rPr>
-        <w:t xml:space="preserve">Figure 8.</w:t>
+        <w:t xml:space="preserve">Figure 7.</w:t>
       </w:r>
       <w:r>
         <w:t xml:space="preserve"> </w:t>
@@ -1791,7 +1791,7 @@
         <w:pStyle w:val="FirstParagraph"/>
       </w:pPr>
       <w:r>
-        <w:t xml:space="preserve">Monthly emissions follow the wind (Figure 7). In case 2 they range from</w:t>
+        <w:t xml:space="preserve">Monthly emissions follow the wind (Figure 8). In case 2 they range from</w:t>
       </w:r>
       <w:r>
         <w:t xml:space="preserve"> </w:t>
@@ -1827,12 +1827,12 @@
           <wp:inline>
             <wp:extent cx="5334000" cy="2545269"/>
             <wp:effectExtent b="0" l="0" r="0" t="0"/>
-            <wp:docPr descr="Figure 7. Monthly CO2 emissions for cases 1–4." title="" id="46" name="Picture"/>
+            <wp:docPr descr="Figure 8. Monthly CO2 emissions for cases 1–4." title="" id="46" name="Picture"/>
             <a:graphic>
               <a:graphicData uri="http://schemas.openxmlformats.org/drawingml/2006/picture">
                 <pic:pic>
                   <pic:nvPicPr>
-                    <pic:cNvPr descr="results/paper/fig07_monthly_co2.png" id="47" name="Picture"/>
+                    <pic:cNvPr descr="results/paper/fig08_monthly_co2.png" id="47" name="Picture"/>
                     <pic:cNvPicPr>
                       <a:picLocks noChangeArrowheads="1" noChangeAspect="1"/>
                     </pic:cNvPicPr>
@@ -1874,7 +1874,7 @@
           <w:bCs/>
           <w:b/>
         </w:rPr>
-        <w:t xml:space="preserve">Figure 7.</w:t>
+        <w:t xml:space="preserve">Figure 8.</w:t>
       </w:r>
       <w:r>
         <w:t xml:space="preserve"> </w:t>
@@ -3826,6 +3826,72 @@
       </w:r>
       <w:r>
         <w:t xml:space="preserve">Tampen within 2 % and the fuel-gas emission factor observed at Gullfaks.</w:t>
+      </w:r>
+    </w:p>
+    <w:p>
+      <w:pPr>
+        <w:numPr>
+          <w:ilvl w:val="0"/>
+          <w:numId w:val="1002"/>
+        </w:numPr>
+        <w:pStyle w:val="Compact"/>
+      </w:pPr>
+      <w:r>
+        <w:t xml:space="preserve">The finding also holds at a tropical gas platform off southern Tanzania</w:t>
+      </w:r>
+      <w:r>
+        <w:t xml:space="preserve"> </w:t>
+      </w:r>
+      <w:r>
+        <w:t xml:space="preserve">(Section 9), where the same wind farm has a capacity factor of only</w:t>
+      </w:r>
+      <w:r>
+        <w:t xml:space="preserve"> </w:t>
+      </w:r>
+      <w:r>
+        <w:t xml:space="preserve">30 %. Wind cuts emissions by 43 % with fixed demand, and flexible</w:t>
+      </w:r>
+      <w:r>
+        <w:t xml:space="preserve"> </w:t>
+      </w:r>
+      <w:r>
+        <w:t xml:space="preserve">scheduling of gas production (using the export pipeline’s line pack)</w:t>
+      </w:r>
+      <w:r>
+        <w:t xml:space="preserve"> </w:t>
+      </w:r>
+      <w:r>
+        <w:t xml:space="preserve">and MEG regeneration saves a further 2.6 kt/yr (4.5 %), again with no</w:t>
+      </w:r>
+      <w:r>
+        <w:t xml:space="preserve"> </w:t>
+      </w:r>
+      <w:r>
+        <w:t xml:space="preserve">lost production. The benefit is less than half the North Sea value</w:t>
+      </w:r>
+      <w:r>
+        <w:t xml:space="preserve"> </w:t>
+      </w:r>
+      <w:r>
+        <w:t xml:space="preserve">because one gas turbine almost covers the smaller platform and the line</w:t>
+      </w:r>
+      <w:r>
+        <w:t xml:space="preserve"> </w:t>
+      </w:r>
+      <w:r>
+        <w:t xml:space="preserve">pack stores only 3.6 h of production: the size of the benefit depends</w:t>
+      </w:r>
+      <w:r>
+        <w:t xml:space="preserve"> </w:t>
+      </w:r>
+      <w:r>
+        <w:t xml:space="preserve">on how many hours of load can be postponed. The small Tanzanian carbon</w:t>
+      </w:r>
+      <w:r>
+        <w:t xml:space="preserve"> </w:t>
+      </w:r>
+      <w:r>
+        <w:t xml:space="preserve">duty of 2025 does not change the result.</w:t>
       </w:r>
     </w:p>
     <w:bookmarkEnd w:id="57"/>

</xml_diff>